<commit_message>
Gestione cantieri e immagini completata + aggiunta registrazione
</commit_message>
<xml_diff>
--- a/Documentazione.docx
+++ b/Documentazione.docx
@@ -2591,23 +2591,7 @@
           <w:sz w:val="22"/>
           <w:szCs w:val="22"/>
         </w:rPr>
-        <w:t>Le password devono essere salvate in modo sicuro (</w:t>
-      </w:r>
-      <w:proofErr w:type="spellStart"/>
-      <w:r>
-        <w:rPr>
-          <w:sz w:val="22"/>
-          <w:szCs w:val="22"/>
-        </w:rPr>
-        <w:t>hash</w:t>
-      </w:r>
-      <w:proofErr w:type="spellEnd"/>
-      <w:r>
-        <w:rPr>
-          <w:sz w:val="22"/>
-          <w:szCs w:val="22"/>
-        </w:rPr>
-        <w:t>).</w:t>
+        <w:t>Le password devono essere salvate in modo sicuro (hash).</w:t>
       </w:r>
     </w:p>
     <w:p>
@@ -2769,10 +2753,10 @@
           <w:noProof/>
         </w:rPr>
         <w:drawing>
-          <wp:inline distT="0" distB="0" distL="0" distR="0" wp14:anchorId="0142D31A" wp14:editId="62CBD0DB">
-            <wp:extent cx="4486275" cy="3503186"/>
+          <wp:inline distT="0" distB="0" distL="0" distR="0" wp14:anchorId="5965E685" wp14:editId="2768E83C">
+            <wp:extent cx="5619750" cy="4385506"/>
             <wp:effectExtent l="0" t="0" r="0" b="0"/>
-            <wp:docPr id="4" name="Immagine 4" descr="Immagine che contiene schermata, design&#10;&#10;Il contenuto generato dall'IA potrebbe non essere corretto."/>
+            <wp:docPr id="3" name="Immagine 3"/>
             <wp:cNvGraphicFramePr>
               <a:graphicFrameLocks xmlns:a="http://schemas.openxmlformats.org/drawingml/2006/main" noChangeAspect="1"/>
             </wp:cNvGraphicFramePr>
@@ -2780,8 +2764,10 @@
               <a:graphicData uri="http://schemas.openxmlformats.org/drawingml/2006/picture">
                 <pic:pic xmlns:pic="http://schemas.openxmlformats.org/drawingml/2006/picture">
                   <pic:nvPicPr>
-                    <pic:cNvPr id="4" name="Immagine 4" descr="Immagine che contiene schermata, design&#10;&#10;Il contenuto generato dall'IA potrebbe non essere corretto."/>
-                    <pic:cNvPicPr/>
+                    <pic:cNvPr id="0" name="Picture 1"/>
+                    <pic:cNvPicPr>
+                      <a:picLocks noChangeAspect="1" noChangeArrowheads="1"/>
+                    </pic:cNvPicPr>
                   </pic:nvPicPr>
                   <pic:blipFill>
                     <a:blip r:embed="rId8">
@@ -2791,18 +2777,23 @@
                         </a:ext>
                       </a:extLst>
                     </a:blip>
+                    <a:srcRect/>
                     <a:stretch>
                       <a:fillRect/>
                     </a:stretch>
                   </pic:blipFill>
-                  <pic:spPr>
+                  <pic:spPr bwMode="auto">
                     <a:xfrm>
                       <a:off x="0" y="0"/>
-                      <a:ext cx="4502869" cy="3516144"/>
+                      <a:ext cx="5624121" cy="4388917"/>
                     </a:xfrm>
                     <a:prstGeom prst="rect">
                       <a:avLst/>
                     </a:prstGeom>
+                    <a:noFill/>
+                    <a:ln>
+                      <a:noFill/>
+                    </a:ln>
                   </pic:spPr>
                 </pic:pic>
               </a:graphicData>

</xml_diff>